<commit_message>
Update portfolio with latest changes and redeploy to Firebase
</commit_message>
<xml_diff>
--- a/Resume.docx
+++ b/Resume.docx
@@ -2,201 +2,92 @@
 <file path=word/document.xml><?xml version="1.0" encoding="utf-8"?>
 <w:document xmlns:wpc="http://schemas.microsoft.com/office/word/2010/wordprocessingCanvas" xmlns:mo="http://schemas.microsoft.com/office/mac/office/2008/main" xmlns:mc="http://schemas.openxmlformats.org/markup-compatibility/2006" xmlns:mv="urn:schemas-microsoft-com:mac:vml" xmlns:o="urn:schemas-microsoft-com:office:office" xmlns:r="http://schemas.openxmlformats.org/officeDocument/2006/relationships" xmlns:m="http://schemas.openxmlformats.org/officeDocument/2006/math" xmlns:v="urn:schemas-microsoft-com:vml" xmlns:wp14="http://schemas.microsoft.com/office/word/2010/wordprocessingDrawing" xmlns:wp="http://schemas.openxmlformats.org/drawingml/2006/wordprocessingDrawing" xmlns:w10="urn:schemas-microsoft-com:office:word" xmlns:w="http://schemas.openxmlformats.org/wordprocessingml/2006/main" xmlns:w14="http://schemas.microsoft.com/office/word/2010/wordml" xmlns:wpg="http://schemas.microsoft.com/office/word/2010/wordprocessingGroup" xmlns:wpi="http://schemas.microsoft.com/office/word/2010/wordprocessingInk" xmlns:wne="http://schemas.microsoft.com/office/word/2006/wordml" xmlns:wps="http://schemas.microsoft.com/office/word/2010/wordprocessingShape" mc:Ignorable="w14 wp14">
   <w:body>
-    <w:tbl>
-      <w:tblPr>
-        <w:tblW w:type="auto" w:w="0"/>
-        <w:jc w:val="center"/>
-        <w:tblLook w:firstColumn="1" w:firstRow="1" w:lastColumn="0" w:lastRow="0" w:noHBand="0" w:noVBand="1" w:val="04A0"/>
-      </w:tblPr>
-      <w:tblGrid>
-        <w:gridCol w:w="9972"/>
-      </w:tblGrid>
-      <w:tr>
-        <w:tc>
-          <w:tcPr>
-            <w:tcW w:type="dxa" w:w="9071"/>
-            <w:shd w:fill="1a1a2e" w:val="clear"/>
-          </w:tcPr>
-          <w:p>
-            <w:pPr>
-              <w:spacing w:before="280" w:after="40"/>
-              <w:jc w:val="center"/>
-            </w:pPr>
-            <w:r>
-              <w:rPr>
-                <w:rFonts w:ascii="Calibri" w:hAnsi="Calibri"/>
-                <w:b/>
-                <w:color w:val="FFFFFF"/>
-                <w:sz w:val="36"/>
-              </w:rPr>
-              <w:t>JUNE DOMINIC G. LAURENTE</w:t>
-            </w:r>
-          </w:p>
-          <w:p>
-            <w:pPr>
-              <w:spacing w:before="0" w:after="200"/>
-              <w:jc w:val="center"/>
-            </w:pPr>
-            <w:r>
-              <w:rPr>
-                <w:rFonts w:ascii="Calibri" w:hAnsi="Calibri"/>
-                <w:color w:val="CCCCDD"/>
-                <w:sz w:val="17"/>
-              </w:rPr>
-              <w:t>P-3 Brgy. Caloc-an, Magallanes, Agusan del Norte  |  0927 230 8675  |  jdomelaurente@gmail.com</w:t>
-            </w:r>
-          </w:p>
-        </w:tc>
-      </w:tr>
-    </w:tbl>
     <w:p>
       <w:pPr>
-        <w:spacing w:after="40"/>
-      </w:pPr>
-    </w:p>
-    <w:tbl>
-      <w:tblPr>
-        <w:tblStyle w:val="TableGrid"/>
-        <w:tblW w:type="auto" w:w="0"/>
-        <w:jc w:val="left"/>
-        <w:tblLayout w:type="autofit"/>
-        <w:tblLook w:firstColumn="1" w:firstRow="1" w:lastColumn="0" w:lastRow="0" w:noHBand="0" w:noVBand="1" w:val="04A0"/>
-      </w:tblPr>
-      <w:tblGrid>
-        <w:gridCol w:w="227"/>
-        <w:gridCol w:w="8844"/>
-      </w:tblGrid>
-      <w:tr>
-        <w:tc>
-          <w:tcPr>
-            <w:tcW w:type="dxa" w:w="227"/>
-            <w:shd w:fill="2c3e6b" w:val="clear"/>
-          </w:tcPr>
-          <w:p>
-            <w:pPr>
-              <w:spacing w:before="160" w:after="160"/>
-            </w:pPr>
-          </w:p>
-        </w:tc>
-        <w:tc>
-          <w:tcPr>
-            <w:tcW w:type="dxa" w:w="8844"/>
-            <w:tcBorders>
-              <w:bottom w:val="single" w:sz="4" w:space="1" w:color="2c3e6b"/>
-            </w:tcBorders>
-          </w:tcPr>
-          <w:p>
-            <w:pPr>
-              <w:spacing w:before="120" w:after="80"/>
-              <w:ind w:left="170"/>
-            </w:pPr>
-            <w:r>
-              <w:rPr>
-                <w:rFonts w:ascii="Calibri" w:hAnsi="Calibri"/>
-                <w:b/>
-                <w:color w:val="2C3E6B"/>
-                <w:sz w:val="23"/>
-              </w:rPr>
-              <w:t>PROFESSIONAL SUMMARY</w:t>
-            </w:r>
-          </w:p>
-        </w:tc>
-      </w:tr>
-    </w:tbl>
-    <w:p>
-      <w:pPr>
-        <w:spacing w:after="40" w:before="0"/>
+        <w:jc w:val="center"/>
       </w:pPr>
       <w:r>
         <w:rPr>
-          <w:sz w:val="2"/>
+          <w:rFonts w:ascii="Calibri" w:hAnsi="Calibri"/>
+          <w:b/>
+          <w:color w:val="1A1A2E"/>
+          <w:sz w:val="40"/>
         </w:rPr>
+        <w:t>JUNE DOMINIC G. LAURENTE</w:t>
       </w:r>
     </w:p>
     <w:p>
       <w:pPr>
-        <w:spacing w:after="80" w:before="0" w:line="276" w:lineRule="auto"/>
+        <w:jc w:val="center"/>
+      </w:pPr>
+      <w:r>
+        <w:rPr>
+          <w:rFonts w:ascii="Calibri" w:hAnsi="Calibri"/>
+          <w:color w:val="555555"/>
+          <w:sz w:val="19"/>
+        </w:rPr>
+        <w:t>P-3 Brgy. Caloc-an, Magallanes, Agusan del Norte  |  0927 230 8675  |  jdomelaurente@gmail.com</w:t>
+      </w:r>
+    </w:p>
+    <w:p>
+      <w:pPr>
+        <w:spacing w:before="200" w:after="80"/>
+        <w:pBdr>
+          <w:bottom w:val="single" w:sz="4" w:space="1" w:color="1a1a2e"/>
+        </w:pBdr>
+      </w:pPr>
+      <w:r>
+        <w:rPr>
+          <w:rFonts w:ascii="Calibri" w:hAnsi="Calibri"/>
+          <w:b/>
+          <w:color w:val="1A1A2E"/>
+          <w:sz w:val="24"/>
+        </w:rPr>
+        <w:t>PROFESSIONAL SUMMARY</w:t>
+      </w:r>
+    </w:p>
+    <w:p>
+      <w:pPr>
+        <w:spacing w:after="80" w:before="0"/>
       </w:pPr>
       <w:r>
         <w:rPr>
           <w:rFonts w:ascii="Calibri" w:hAnsi="Calibri"/>
           <w:b w:val="0"/>
           <w:i w:val="0"/>
-          <w:color w:val="2D2D2D"/>
-          <w:sz w:val="20"/>
+          <w:color w:val="333333"/>
+          <w:sz w:val="21"/>
         </w:rPr>
         <w:t>Highly motivated Information Technology graduate (Batch 2026) and Full-Stack Web Developer with proven experience in building scalable web applications using Vue.js, Django, and Firebase. Skilled in database management, UI/UX design, and hardware troubleshooting. Passionate about creating efficient digital solutions and eager to contribute to a dynamic development team.</w:t>
       </w:r>
     </w:p>
-    <w:tbl>
-      <w:tblPr>
-        <w:tblStyle w:val="TableGrid"/>
-        <w:tblW w:type="auto" w:w="0"/>
-        <w:jc w:val="left"/>
-        <w:tblLayout w:type="autofit"/>
-        <w:tblLook w:firstColumn="1" w:firstRow="1" w:lastColumn="0" w:lastRow="0" w:noHBand="0" w:noVBand="1" w:val="04A0"/>
-      </w:tblPr>
-      <w:tblGrid>
-        <w:gridCol w:w="227"/>
-        <w:gridCol w:w="8844"/>
-      </w:tblGrid>
-      <w:tr>
-        <w:tc>
-          <w:tcPr>
-            <w:tcW w:type="dxa" w:w="227"/>
-            <w:shd w:fill="2c3e6b" w:val="clear"/>
-          </w:tcPr>
-          <w:p>
-            <w:pPr>
-              <w:spacing w:before="160" w:after="160"/>
-            </w:pPr>
-          </w:p>
-        </w:tc>
-        <w:tc>
-          <w:tcPr>
-            <w:tcW w:type="dxa" w:w="8844"/>
-            <w:tcBorders>
-              <w:bottom w:val="single" w:sz="4" w:space="1" w:color="2c3e6b"/>
-            </w:tcBorders>
-          </w:tcPr>
-          <w:p>
-            <w:pPr>
-              <w:spacing w:before="120" w:after="80"/>
-              <w:ind w:left="170"/>
-            </w:pPr>
-            <w:r>
-              <w:rPr>
-                <w:rFonts w:ascii="Calibri" w:hAnsi="Calibri"/>
-                <w:b/>
-                <w:color w:val="2C3E6B"/>
-                <w:sz w:val="23"/>
-              </w:rPr>
-              <w:t>EXPERIENCE</w:t>
-            </w:r>
-          </w:p>
-        </w:tc>
-      </w:tr>
-    </w:tbl>
     <w:p>
       <w:pPr>
-        <w:spacing w:after="40" w:before="0"/>
+        <w:spacing w:before="200" w:after="80"/>
+        <w:pBdr>
+          <w:bottom w:val="single" w:sz="4" w:space="1" w:color="1a1a2e"/>
+        </w:pBdr>
       </w:pPr>
       <w:r>
         <w:rPr>
-          <w:sz w:val="2"/>
+          <w:rFonts w:ascii="Calibri" w:hAnsi="Calibri"/>
+          <w:b/>
+          <w:color w:val="1A1A2E"/>
+          <w:sz w:val="24"/>
         </w:rPr>
+        <w:t>EXPERIENCE</w:t>
       </w:r>
     </w:p>
     <w:p>
       <w:pPr>
-        <w:spacing w:after="60" w:before="0" w:line="276" w:lineRule="auto"/>
+        <w:spacing w:after="80" w:before="0"/>
       </w:pPr>
       <w:r>
         <w:rPr>
           <w:rFonts w:ascii="Calibri" w:hAnsi="Calibri"/>
           <w:b/>
           <w:i w:val="0"/>
-          <w:color w:val="2D2D2D"/>
+          <w:color w:val="333333"/>
           <w:sz w:val="22"/>
         </w:rPr>
         <w:t>On-the-Job Trainee – MIS Office</w:t>
@@ -204,7 +95,255 @@
     </w:p>
     <w:p>
       <w:pPr>
-        <w:spacing w:after="60" w:before="0" w:line="276" w:lineRule="auto"/>
+        <w:spacing w:after="80" w:before="0"/>
+        <w:ind w:left="170"/>
+      </w:pPr>
+      <w:r>
+        <w:rPr>
+          <w:rFonts w:ascii="Calibri" w:hAnsi="Calibri"/>
+          <w:b w:val="0"/>
+          <w:i w:val="0"/>
+          <w:color w:val="333333"/>
+          <w:sz w:val="20"/>
+        </w:rPr>
+        <w:t>Caraga State University – Cabadbaran Campus  |  2025</w:t>
+      </w:r>
+    </w:p>
+    <w:p>
+      <w:pPr>
+        <w:spacing w:after="120" w:before="0"/>
+        <w:ind w:left="170"/>
+      </w:pPr>
+      <w:r>
+        <w:rPr>
+          <w:rFonts w:ascii="Calibri" w:hAnsi="Calibri"/>
+          <w:b w:val="0"/>
+          <w:i w:val="0"/>
+          <w:color w:val="333333"/>
+          <w:sz w:val="20"/>
+        </w:rPr>
+        <w:t>Assisted in maintaining and troubleshooting university IT systems, including network infrastructure, computer hardware, and software deployments. Supported the MIS team in database management, system documentation, and technical support for administrative and academic offices.</w:t>
+      </w:r>
+    </w:p>
+    <w:p>
+      <w:pPr>
+        <w:spacing w:before="200" w:after="80"/>
+        <w:pBdr>
+          <w:bottom w:val="single" w:sz="4" w:space="1" w:color="1a1a2e"/>
+        </w:pBdr>
+      </w:pPr>
+      <w:r>
+        <w:rPr>
+          <w:rFonts w:ascii="Calibri" w:hAnsi="Calibri"/>
+          <w:b/>
+          <w:color w:val="1A1A2E"/>
+          <w:sz w:val="24"/>
+        </w:rPr>
+        <w:t>EDUCATION</w:t>
+      </w:r>
+    </w:p>
+    <w:p>
+      <w:pPr>
+        <w:spacing w:after="80" w:before="0"/>
+      </w:pPr>
+      <w:r>
+        <w:rPr>
+          <w:rFonts w:ascii="Calibri" w:hAnsi="Calibri"/>
+          <w:b/>
+          <w:i w:val="0"/>
+          <w:color w:val="333333"/>
+          <w:sz w:val="22"/>
+        </w:rPr>
+        <w:t>Bachelor of Science in Information Technology</w:t>
+      </w:r>
+    </w:p>
+    <w:p>
+      <w:pPr>
+        <w:spacing w:after="80" w:before="0"/>
+        <w:ind w:left="170"/>
+      </w:pPr>
+      <w:r>
+        <w:rPr>
+          <w:rFonts w:ascii="Calibri" w:hAnsi="Calibri"/>
+          <w:b w:val="0"/>
+          <w:i w:val="0"/>
+          <w:color w:val="333333"/>
+          <w:sz w:val="20"/>
+        </w:rPr>
+        <w:t>Caraga State University – Cabadbaran Campus  |  2022 – 2026</w:t>
+      </w:r>
+    </w:p>
+    <w:p>
+      <w:pPr>
+        <w:spacing w:after="80" w:before="0"/>
+      </w:pPr>
+      <w:r>
+        <w:rPr>
+          <w:rFonts w:ascii="Calibri" w:hAnsi="Calibri"/>
+          <w:b/>
+          <w:i w:val="0"/>
+          <w:color w:val="333333"/>
+          <w:sz w:val="22"/>
+        </w:rPr>
+        <w:t>Senior High School (ICT – Animation)</w:t>
+      </w:r>
+    </w:p>
+    <w:p>
+      <w:pPr>
+        <w:spacing w:after="120" w:before="0"/>
+        <w:ind w:left="170"/>
+      </w:pPr>
+      <w:r>
+        <w:rPr>
+          <w:rFonts w:ascii="Calibri" w:hAnsi="Calibri"/>
+          <w:b w:val="0"/>
+          <w:i w:val="0"/>
+          <w:color w:val="333333"/>
+          <w:sz w:val="20"/>
+        </w:rPr>
+        <w:t>Magallanes National High School  |  2020 – 2022</w:t>
+      </w:r>
+    </w:p>
+    <w:p>
+      <w:pPr>
+        <w:spacing w:before="200" w:after="80"/>
+        <w:pBdr>
+          <w:bottom w:val="single" w:sz="4" w:space="1" w:color="1a1a2e"/>
+        </w:pBdr>
+      </w:pPr>
+      <w:r>
+        <w:rPr>
+          <w:rFonts w:ascii="Calibri" w:hAnsi="Calibri"/>
+          <w:b/>
+          <w:color w:val="1A1A2E"/>
+          <w:sz w:val="24"/>
+        </w:rPr>
+        <w:t>TECHNICAL SKILLS</w:t>
+      </w:r>
+    </w:p>
+    <w:p>
+      <w:pPr>
+        <w:spacing w:after="40" w:before="0"/>
+        <w:ind w:left="170"/>
+      </w:pPr>
+      <w:r>
+        <w:rPr>
+          <w:rFonts w:ascii="Calibri" w:hAnsi="Calibri"/>
+          <w:b/>
+          <w:sz w:val="20"/>
+        </w:rPr>
+        <w:t xml:space="preserve">Web &amp; Software: </w:t>
+      </w:r>
+      <w:r>
+        <w:rPr>
+          <w:rFonts w:ascii="Calibri" w:hAnsi="Calibri"/>
+          <w:color w:val="333333"/>
+          <w:sz w:val="20"/>
+        </w:rPr>
+        <w:t>HTML, CSS, JavaScript, PHP, Flask, Django, Vue.js, SQLAlchemy</w:t>
+      </w:r>
+    </w:p>
+    <w:p>
+      <w:pPr>
+        <w:spacing w:after="40" w:before="0"/>
+        <w:ind w:left="170"/>
+      </w:pPr>
+      <w:r>
+        <w:rPr>
+          <w:rFonts w:ascii="Calibri" w:hAnsi="Calibri"/>
+          <w:b/>
+          <w:sz w:val="20"/>
+        </w:rPr>
+        <w:t xml:space="preserve">Database: </w:t>
+      </w:r>
+      <w:r>
+        <w:rPr>
+          <w:rFonts w:ascii="Calibri" w:hAnsi="Calibri"/>
+          <w:color w:val="333333"/>
+          <w:sz w:val="20"/>
+        </w:rPr>
+        <w:t>MySQL, PostgreSQL, Firebase Firestore</w:t>
+      </w:r>
+    </w:p>
+    <w:p>
+      <w:pPr>
+        <w:spacing w:after="40" w:before="0"/>
+        <w:ind w:left="170"/>
+      </w:pPr>
+      <w:r>
+        <w:rPr>
+          <w:rFonts w:ascii="Calibri" w:hAnsi="Calibri"/>
+          <w:b/>
+          <w:sz w:val="20"/>
+        </w:rPr>
+        <w:t xml:space="preserve">Design &amp; Tools: </w:t>
+      </w:r>
+      <w:r>
+        <w:rPr>
+          <w:rFonts w:ascii="Calibri" w:hAnsi="Calibri"/>
+          <w:color w:val="333333"/>
+          <w:sz w:val="20"/>
+        </w:rPr>
+        <w:t>Figma, Adobe Illustrator, Git/GitHub, Bootstrap, Tailwind CSS</w:t>
+      </w:r>
+    </w:p>
+    <w:p>
+      <w:pPr>
+        <w:spacing w:after="40" w:before="0"/>
+        <w:ind w:left="170"/>
+      </w:pPr>
+      <w:r>
+        <w:rPr>
+          <w:rFonts w:ascii="Calibri" w:hAnsi="Calibri"/>
+          <w:b/>
+          <w:sz w:val="20"/>
+        </w:rPr>
+        <w:t xml:space="preserve">Hardware &amp; Networking: </w:t>
+      </w:r>
+      <w:r>
+        <w:rPr>
+          <w:rFonts w:ascii="Calibri" w:hAnsi="Calibri"/>
+          <w:color w:val="333333"/>
+          <w:sz w:val="20"/>
+        </w:rPr>
+        <w:t>Computer assembly, mobile repair, network troubleshooting</w:t>
+      </w:r>
+    </w:p>
+    <w:p>
+      <w:pPr>
+        <w:spacing w:before="200" w:after="80"/>
+        <w:pBdr>
+          <w:bottom w:val="single" w:sz="4" w:space="1" w:color="1a1a2e"/>
+        </w:pBdr>
+      </w:pPr>
+      <w:r>
+        <w:rPr>
+          <w:rFonts w:ascii="Calibri" w:hAnsi="Calibri"/>
+          <w:b/>
+          <w:color w:val="1A1A2E"/>
+          <w:sz w:val="24"/>
+        </w:rPr>
+        <w:t>PROJECTS</w:t>
+      </w:r>
+    </w:p>
+    <w:p>
+      <w:pPr>
+        <w:spacing w:after="80" w:before="0"/>
+      </w:pPr>
+      <w:r>
+        <w:rPr>
+          <w:rFonts w:ascii="Calibri" w:hAnsi="Calibri"/>
+          <w:b/>
+          <w:i w:val="0"/>
+          <w:color w:val="333333"/>
+          <w:sz w:val="22"/>
+        </w:rPr>
+        <w:t>La Union Senior High School Document Request Management System</w:t>
+      </w:r>
+    </w:p>
+    <w:p>
+      <w:pPr>
+        <w:spacing w:after="40" w:before="0"/>
         <w:ind w:left="170"/>
       </w:pPr>
       <w:r>
@@ -212,15 +351,15 @@
           <w:rFonts w:ascii="Calibri" w:hAnsi="Calibri"/>
           <w:b w:val="0"/>
           <w:i/>
-          <w:color w:val="2D2D2D"/>
+          <w:color w:val="333333"/>
           <w:sz w:val="18"/>
         </w:rPr>
-        <w:t>Caraga State University – Cabadbaran Campus  |  2025</w:t>
+        <w:t>Commission Project | Vue 3  |  Django 5.2  |  DRF  |  PostgreSQL  |  Vercel + Render</w:t>
       </w:r>
     </w:p>
     <w:p>
       <w:pPr>
-        <w:spacing w:after="100" w:before="0" w:line="276" w:lineRule="auto"/>
+        <w:spacing w:after="120" w:before="0"/>
         <w:ind w:left="170"/>
       </w:pPr>
       <w:r>
@@ -228,89 +367,46 @@
           <w:rFonts w:ascii="Calibri" w:hAnsi="Calibri"/>
           <w:b w:val="0"/>
           <w:i w:val="0"/>
-          <w:color w:val="2D2D2D"/>
+          <w:color w:val="333333"/>
           <w:sz w:val="20"/>
         </w:rPr>
-        <w:t>Assisted in maintaining and troubleshooting university IT systems, including network infrastructure, computer hardware, and software deployments. Supported the MIS team in database management, system documentation, and technical support for administrative and academic offices.</w:t>
-      </w:r>
-    </w:p>
-    <w:tbl>
-      <w:tblPr>
-        <w:tblStyle w:val="TableGrid"/>
-        <w:tblW w:type="auto" w:w="0"/>
-        <w:jc w:val="left"/>
-        <w:tblLayout w:type="autofit"/>
-        <w:tblLook w:firstColumn="1" w:firstRow="1" w:lastColumn="0" w:lastRow="0" w:noHBand="0" w:noVBand="1" w:val="04A0"/>
-      </w:tblPr>
-      <w:tblGrid>
-        <w:gridCol w:w="227"/>
-        <w:gridCol w:w="8844"/>
-      </w:tblGrid>
-      <w:tr>
-        <w:tc>
-          <w:tcPr>
-            <w:tcW w:type="dxa" w:w="227"/>
-            <w:shd w:fill="2c3e6b" w:val="clear"/>
-          </w:tcPr>
-          <w:p>
-            <w:pPr>
-              <w:spacing w:before="160" w:after="160"/>
-            </w:pPr>
-          </w:p>
-        </w:tc>
-        <w:tc>
-          <w:tcPr>
-            <w:tcW w:type="dxa" w:w="8844"/>
-            <w:tcBorders>
-              <w:bottom w:val="single" w:sz="4" w:space="1" w:color="2c3e6b"/>
-            </w:tcBorders>
-          </w:tcPr>
-          <w:p>
-            <w:pPr>
-              <w:spacing w:before="120" w:after="80"/>
-              <w:ind w:left="170"/>
-            </w:pPr>
-            <w:r>
-              <w:rPr>
-                <w:rFonts w:ascii="Calibri" w:hAnsi="Calibri"/>
-                <w:b/>
-                <w:color w:val="2C3E6B"/>
-                <w:sz w:val="23"/>
-              </w:rPr>
-              <w:t>EDUCATION</w:t>
-            </w:r>
-          </w:p>
-        </w:tc>
-      </w:tr>
-    </w:tbl>
-    <w:p>
-      <w:pPr>
-        <w:spacing w:after="40" w:before="0"/>
-      </w:pPr>
-      <w:r>
-        <w:rPr>
-          <w:sz w:val="2"/>
-        </w:rPr>
+        <w:t>A commissioned document request system built for La Union Senior High School with passkey-based tracking, pickup scheduling, and audit logs for student and administrative use.</w:t>
       </w:r>
     </w:p>
     <w:p>
       <w:pPr>
-        <w:spacing w:after="60" w:before="0" w:line="276" w:lineRule="auto"/>
+        <w:spacing w:after="80" w:before="0"/>
       </w:pPr>
       <w:r>
         <w:rPr>
           <w:rFonts w:ascii="Calibri" w:hAnsi="Calibri"/>
           <w:b/>
           <w:i w:val="0"/>
-          <w:color w:val="2D2D2D"/>
+          <w:color w:val="333333"/>
           <w:sz w:val="22"/>
         </w:rPr>
-        <w:t>Bachelor of Science in Information Technology</w:t>
+        <w:t>Maison des Fleurs</w:t>
       </w:r>
     </w:p>
     <w:p>
       <w:pPr>
-        <w:spacing w:after="60" w:before="0" w:line="276" w:lineRule="auto"/>
+        <w:spacing w:after="40" w:before="0"/>
+        <w:ind w:left="170"/>
+      </w:pPr>
+      <w:r>
+        <w:rPr>
+          <w:rFonts w:ascii="Calibri" w:hAnsi="Calibri"/>
+          <w:b w:val="0"/>
+          <w:i/>
+          <w:color w:val="333333"/>
+          <w:sz w:val="18"/>
+        </w:rPr>
+        <w:t>Commission Project | Flask  |  SQLite  |  SQLAlchemy  |  Flask-Login  |  Bootstrap</w:t>
+      </w:r>
+    </w:p>
+    <w:p>
+      <w:pPr>
+        <w:spacing w:after="120" w:before="0"/>
         <w:ind w:left="170"/>
       </w:pPr>
       <w:r>
@@ -318,30 +414,46 @@
           <w:rFonts w:ascii="Calibri" w:hAnsi="Calibri"/>
           <w:b w:val="0"/>
           <w:i w:val="0"/>
-          <w:color w:val="2D2D2D"/>
-          <w:sz w:val="19"/>
+          <w:color w:val="333333"/>
+          <w:sz w:val="20"/>
         </w:rPr>
-        <w:t>Caraga State University – Cabadbaran Campus  |  2022 – 2026</w:t>
+        <w:t>A commissioned flower shop system for a student project at Father Saturnino Urios University featuring authentication, product browsing, session-based cart flow, checkout, and admin management tools.</w:t>
       </w:r>
     </w:p>
     <w:p>
       <w:pPr>
-        <w:spacing w:after="60" w:before="0" w:line="276" w:lineRule="auto"/>
+        <w:spacing w:after="80" w:before="0"/>
       </w:pPr>
       <w:r>
         <w:rPr>
           <w:rFonts w:ascii="Calibri" w:hAnsi="Calibri"/>
           <w:b/>
           <w:i w:val="0"/>
-          <w:color w:val="2D2D2D"/>
+          <w:color w:val="333333"/>
           <w:sz w:val="22"/>
         </w:rPr>
-        <w:t>Senior High School (ICT – Animation)</w:t>
+        <w:t>Smart Flight Booking Simulation Platform with LMS Integration</w:t>
       </w:r>
     </w:p>
     <w:p>
       <w:pPr>
-        <w:spacing w:after="100" w:before="0" w:line="276" w:lineRule="auto"/>
+        <w:spacing w:after="40" w:before="0"/>
+        <w:ind w:left="170"/>
+      </w:pPr>
+      <w:r>
+        <w:rPr>
+          <w:rFonts w:ascii="Calibri" w:hAnsi="Calibri"/>
+          <w:b w:val="0"/>
+          <w:i/>
+          <w:color w:val="333333"/>
+          <w:sz w:val="18"/>
+        </w:rPr>
+        <w:t>Capstone Project – A Data-Driven Training and Competency Assessment Tool for CTHM-CSUCC</w:t>
+      </w:r>
+    </w:p>
+    <w:p>
+      <w:pPr>
+        <w:spacing w:after="120" w:before="0"/>
         <w:ind w:left="170"/>
       </w:pPr>
       <w:r>
@@ -349,521 +461,39 @@
           <w:rFonts w:ascii="Calibri" w:hAnsi="Calibri"/>
           <w:b w:val="0"/>
           <w:i w:val="0"/>
-          <w:color w:val="2D2D2D"/>
-          <w:sz w:val="19"/>
+          <w:color w:val="333333"/>
+          <w:sz w:val="20"/>
         </w:rPr>
-        <w:t>Magallanes National High School  |  2020 – 2022</w:t>
-      </w:r>
-    </w:p>
-    <w:tbl>
-      <w:tblPr>
-        <w:tblStyle w:val="TableGrid"/>
-        <w:tblW w:type="auto" w:w="0"/>
-        <w:jc w:val="left"/>
-        <w:tblLayout w:type="autofit"/>
-        <w:tblLook w:firstColumn="1" w:firstRow="1" w:lastColumn="0" w:lastRow="0" w:noHBand="0" w:noVBand="1" w:val="04A0"/>
-      </w:tblPr>
-      <w:tblGrid>
-        <w:gridCol w:w="227"/>
-        <w:gridCol w:w="8844"/>
-      </w:tblGrid>
-      <w:tr>
-        <w:tc>
-          <w:tcPr>
-            <w:tcW w:type="dxa" w:w="227"/>
-            <w:shd w:fill="2c3e6b" w:val="clear"/>
-          </w:tcPr>
-          <w:p>
-            <w:pPr>
-              <w:spacing w:before="160" w:after="160"/>
-            </w:pPr>
-          </w:p>
-        </w:tc>
-        <w:tc>
-          <w:tcPr>
-            <w:tcW w:type="dxa" w:w="8844"/>
-            <w:tcBorders>
-              <w:bottom w:val="single" w:sz="4" w:space="1" w:color="2c3e6b"/>
-            </w:tcBorders>
-          </w:tcPr>
-          <w:p>
-            <w:pPr>
-              <w:spacing w:before="120" w:after="80"/>
-              <w:ind w:left="170"/>
-            </w:pPr>
-            <w:r>
-              <w:rPr>
-                <w:rFonts w:ascii="Calibri" w:hAnsi="Calibri"/>
-                <w:b/>
-                <w:color w:val="2C3E6B"/>
-                <w:sz w:val="23"/>
-              </w:rPr>
-              <w:t>TECHNICAL SKILLS</w:t>
-            </w:r>
-          </w:p>
-        </w:tc>
-      </w:tr>
-    </w:tbl>
-    <w:p>
-      <w:pPr>
-        <w:spacing w:after="40" w:before="0"/>
-      </w:pPr>
-      <w:r>
-        <w:rPr>
-          <w:sz w:val="2"/>
-        </w:rPr>
-      </w:r>
-    </w:p>
-    <w:tbl>
-      <w:tblPr>
-        <w:tblW w:type="auto" w:w="0"/>
-        <w:jc w:val="left"/>
-        <w:tblLook w:firstColumn="1" w:firstRow="1" w:lastColumn="0" w:lastRow="0" w:noHBand="0" w:noVBand="1" w:val="04A0"/>
-      </w:tblPr>
-      <w:tblGrid>
-        <w:gridCol w:w="1984"/>
-        <w:gridCol w:w="7087"/>
-      </w:tblGrid>
-      <w:tr>
-        <w:tc>
-          <w:tcPr>
-            <w:tcW w:type="dxa" w:w="1984"/>
-            <w:shd w:fill="f0f0f5" w:val="clear"/>
-          </w:tcPr>
-          <w:p>
-            <w:pPr>
-              <w:spacing w:before="40" w:after="40"/>
-              <w:ind w:left="113"/>
-            </w:pPr>
-            <w:r>
-              <w:rPr>
-                <w:rFonts w:ascii="Calibri" w:hAnsi="Calibri"/>
-                <w:b/>
-                <w:color w:val="2C3E6B"/>
-                <w:sz w:val="18"/>
-              </w:rPr>
-              <w:t>Web &amp; Software</w:t>
-            </w:r>
-          </w:p>
-        </w:tc>
-        <w:tc>
-          <w:tcPr>
-            <w:tcW w:type="dxa" w:w="7087"/>
-          </w:tcPr>
-          <w:p>
-            <w:pPr>
-              <w:spacing w:before="40" w:after="40"/>
-              <w:ind w:left="170"/>
-            </w:pPr>
-            <w:r>
-              <w:rPr>
-                <w:rFonts w:ascii="Calibri" w:hAnsi="Calibri"/>
-                <w:color w:val="2D2D2D"/>
-                <w:sz w:val="18"/>
-              </w:rPr>
-              <w:t>HTML, CSS, JavaScript, PHP, Flask, Django, Vue.js, SQLAlchemy</w:t>
-            </w:r>
-          </w:p>
-        </w:tc>
-      </w:tr>
-      <w:tr>
-        <w:tc>
-          <w:tcPr>
-            <w:tcW w:type="dxa" w:w="1984"/>
-            <w:shd w:fill="f0f0f5" w:val="clear"/>
-          </w:tcPr>
-          <w:p>
-            <w:pPr>
-              <w:spacing w:before="40" w:after="40"/>
-              <w:ind w:left="113"/>
-            </w:pPr>
-            <w:r>
-              <w:rPr>
-                <w:rFonts w:ascii="Calibri" w:hAnsi="Calibri"/>
-                <w:b/>
-                <w:color w:val="2C3E6B"/>
-                <w:sz w:val="18"/>
-              </w:rPr>
-              <w:t>Database</w:t>
-            </w:r>
-          </w:p>
-        </w:tc>
-        <w:tc>
-          <w:tcPr>
-            <w:tcW w:type="dxa" w:w="7087"/>
-          </w:tcPr>
-          <w:p>
-            <w:pPr>
-              <w:spacing w:before="40" w:after="40"/>
-              <w:ind w:left="170"/>
-            </w:pPr>
-            <w:r>
-              <w:rPr>
-                <w:rFonts w:ascii="Calibri" w:hAnsi="Calibri"/>
-                <w:color w:val="2D2D2D"/>
-                <w:sz w:val="18"/>
-              </w:rPr>
-              <w:t>MySQL, PostgreSQL, Firebase Firestore</w:t>
-            </w:r>
-          </w:p>
-        </w:tc>
-      </w:tr>
-      <w:tr>
-        <w:tc>
-          <w:tcPr>
-            <w:tcW w:type="dxa" w:w="1984"/>
-            <w:shd w:fill="f0f0f5" w:val="clear"/>
-          </w:tcPr>
-          <w:p>
-            <w:pPr>
-              <w:spacing w:before="40" w:after="40"/>
-              <w:ind w:left="113"/>
-            </w:pPr>
-            <w:r>
-              <w:rPr>
-                <w:rFonts w:ascii="Calibri" w:hAnsi="Calibri"/>
-                <w:b/>
-                <w:color w:val="2C3E6B"/>
-                <w:sz w:val="18"/>
-              </w:rPr>
-              <w:t>Design &amp; Tools</w:t>
-            </w:r>
-          </w:p>
-        </w:tc>
-        <w:tc>
-          <w:tcPr>
-            <w:tcW w:type="dxa" w:w="7087"/>
-          </w:tcPr>
-          <w:p>
-            <w:pPr>
-              <w:spacing w:before="40" w:after="40"/>
-              <w:ind w:left="170"/>
-            </w:pPr>
-            <w:r>
-              <w:rPr>
-                <w:rFonts w:ascii="Calibri" w:hAnsi="Calibri"/>
-                <w:color w:val="2D2D2D"/>
-                <w:sz w:val="18"/>
-              </w:rPr>
-              <w:t>Figma, Adobe Illustrator, Git/GitHub, Bootstrap, Tailwind CSS</w:t>
-            </w:r>
-          </w:p>
-        </w:tc>
-      </w:tr>
-      <w:tr>
-        <w:tc>
-          <w:tcPr>
-            <w:tcW w:type="dxa" w:w="1984"/>
-            <w:shd w:fill="f0f0f5" w:val="clear"/>
-          </w:tcPr>
-          <w:p>
-            <w:pPr>
-              <w:spacing w:before="40" w:after="40"/>
-              <w:ind w:left="113"/>
-            </w:pPr>
-            <w:r>
-              <w:rPr>
-                <w:rFonts w:ascii="Calibri" w:hAnsi="Calibri"/>
-                <w:b/>
-                <w:color w:val="2C3E6B"/>
-                <w:sz w:val="18"/>
-              </w:rPr>
-              <w:t>Hardware &amp; Networking</w:t>
-            </w:r>
-          </w:p>
-        </w:tc>
-        <w:tc>
-          <w:tcPr>
-            <w:tcW w:type="dxa" w:w="7087"/>
-          </w:tcPr>
-          <w:p>
-            <w:pPr>
-              <w:spacing w:before="40" w:after="40"/>
-              <w:ind w:left="170"/>
-            </w:pPr>
-            <w:r>
-              <w:rPr>
-                <w:rFonts w:ascii="Calibri" w:hAnsi="Calibri"/>
-                <w:color w:val="2D2D2D"/>
-                <w:sz w:val="18"/>
-              </w:rPr>
-              <w:t>Computer assembly, mobile repair, network troubleshooting</w:t>
-            </w:r>
-          </w:p>
-        </w:tc>
-      </w:tr>
-    </w:tbl>
-    <w:p>
-      <w:pPr>
-        <w:spacing w:after="40"/>
-      </w:pPr>
-    </w:p>
-    <w:tbl>
-      <w:tblPr>
-        <w:tblStyle w:val="TableGrid"/>
-        <w:tblW w:type="auto" w:w="0"/>
-        <w:jc w:val="left"/>
-        <w:tblLayout w:type="autofit"/>
-        <w:tblLook w:firstColumn="1" w:firstRow="1" w:lastColumn="0" w:lastRow="0" w:noHBand="0" w:noVBand="1" w:val="04A0"/>
-      </w:tblPr>
-      <w:tblGrid>
-        <w:gridCol w:w="227"/>
-        <w:gridCol w:w="8844"/>
-      </w:tblGrid>
-      <w:tr>
-        <w:tc>
-          <w:tcPr>
-            <w:tcW w:type="dxa" w:w="227"/>
-            <w:shd w:fill="2c3e6b" w:val="clear"/>
-          </w:tcPr>
-          <w:p>
-            <w:pPr>
-              <w:spacing w:before="160" w:after="160"/>
-            </w:pPr>
-          </w:p>
-        </w:tc>
-        <w:tc>
-          <w:tcPr>
-            <w:tcW w:type="dxa" w:w="8844"/>
-            <w:tcBorders>
-              <w:bottom w:val="single" w:sz="4" w:space="1" w:color="2c3e6b"/>
-            </w:tcBorders>
-          </w:tcPr>
-          <w:p>
-            <w:pPr>
-              <w:spacing w:before="120" w:after="80"/>
-              <w:ind w:left="170"/>
-            </w:pPr>
-            <w:r>
-              <w:rPr>
-                <w:rFonts w:ascii="Calibri" w:hAnsi="Calibri"/>
-                <w:b/>
-                <w:color w:val="2C3E6B"/>
-                <w:sz w:val="23"/>
-              </w:rPr>
-              <w:t>PROJECTS</w:t>
-            </w:r>
-          </w:p>
-        </w:tc>
-      </w:tr>
-    </w:tbl>
-    <w:p>
-      <w:pPr>
-        <w:spacing w:after="40" w:before="0"/>
-      </w:pPr>
-      <w:r>
-        <w:rPr>
-          <w:sz w:val="2"/>
-        </w:rPr>
+        <w:t>A simulation platform integrating flight booking ecosystems with a Learning Management System for hands-on training, competency assessment, and performance tracking of hospitality and tourism students.</w:t>
       </w:r>
     </w:p>
     <w:p>
       <w:pPr>
-        <w:spacing w:after="60" w:before="0" w:line="276" w:lineRule="auto"/>
+        <w:spacing w:before="200" w:after="80"/>
+        <w:pBdr>
+          <w:bottom w:val="single" w:sz="4" w:space="1" w:color="1a1a2e"/>
+        </w:pBdr>
       </w:pPr>
       <w:r>
         <w:rPr>
           <w:rFonts w:ascii="Calibri" w:hAnsi="Calibri"/>
           <w:b/>
-          <w:i w:val="0"/>
-          <w:color w:val="2D2D2D"/>
-          <w:sz w:val="22"/>
+          <w:color w:val="1A1A2E"/>
+          <w:sz w:val="24"/>
         </w:rPr>
-        <w:t>La Union Senior High School Document Request Management System</w:t>
-      </w:r>
-    </w:p>
-    <w:p>
-      <w:pPr>
-        <w:spacing w:after="20" w:before="0"/>
-        <w:ind w:left="170"/>
-      </w:pPr>
-      <w:r>
-        <w:rPr>
-          <w:rFonts w:ascii="Calibri" w:hAnsi="Calibri"/>
-          <w:i/>
-          <w:color w:val="666666"/>
-          <w:sz w:val="17"/>
-        </w:rPr>
-        <w:t>Commission Project  |  Vue 3  |  Django 5.2  |  DRF  |  PostgreSQL  |  Vercel + Render</w:t>
-      </w:r>
-    </w:p>
-    <w:p>
-      <w:pPr>
-        <w:spacing w:after="80" w:before="0" w:line="276" w:lineRule="auto"/>
-        <w:ind w:left="170"/>
-      </w:pPr>
-      <w:r>
-        <w:rPr>
-          <w:rFonts w:ascii="Calibri" w:hAnsi="Calibri"/>
-          <w:b w:val="0"/>
-          <w:i w:val="0"/>
-          <w:color w:val="2D2D2D"/>
-          <w:sz w:val="20"/>
-        </w:rPr>
-        <w:t>A commissioned document request system built for La Union Senior High School with passkey-based tracking, pickup scheduling, and audit logs for student and administrative use.</w:t>
-      </w:r>
-    </w:p>
-    <w:p>
-      <w:pPr>
-        <w:spacing w:after="60" w:before="0" w:line="276" w:lineRule="auto"/>
-      </w:pPr>
-      <w:r>
-        <w:rPr>
-          <w:rFonts w:ascii="Calibri" w:hAnsi="Calibri"/>
-          <w:b/>
-          <w:i w:val="0"/>
-          <w:color w:val="2D2D2D"/>
-          <w:sz w:val="22"/>
-        </w:rPr>
-        <w:t>Maison des Fleurs</w:t>
-      </w:r>
-    </w:p>
-    <w:p>
-      <w:pPr>
-        <w:spacing w:after="20" w:before="0"/>
-        <w:ind w:left="170"/>
-      </w:pPr>
-      <w:r>
-        <w:rPr>
-          <w:rFonts w:ascii="Calibri" w:hAnsi="Calibri"/>
-          <w:i/>
-          <w:color w:val="666666"/>
-          <w:sz w:val="17"/>
-        </w:rPr>
-        <w:t>Commission Project  |  Flask  |  SQLite  |  SQLAlchemy  |  Flask-Login  |  Bootstrap</w:t>
-      </w:r>
-    </w:p>
-    <w:p>
-      <w:pPr>
-        <w:spacing w:after="80" w:before="0" w:line="276" w:lineRule="auto"/>
-        <w:ind w:left="170"/>
-      </w:pPr>
-      <w:r>
-        <w:rPr>
-          <w:rFonts w:ascii="Calibri" w:hAnsi="Calibri"/>
-          <w:b w:val="0"/>
-          <w:i w:val="0"/>
-          <w:color w:val="2D2D2D"/>
-          <w:sz w:val="20"/>
-        </w:rPr>
-        <w:t>A commissioned flower shop system for a student project at Father Saturnino Urios University featuring authentication, product browsing, session-based cart flow, checkout, and admin management tools.</w:t>
-      </w:r>
-    </w:p>
-    <w:p>
-      <w:pPr>
-        <w:spacing w:after="60" w:before="0" w:line="276" w:lineRule="auto"/>
-      </w:pPr>
-      <w:r>
-        <w:rPr>
-          <w:rFonts w:ascii="Calibri" w:hAnsi="Calibri"/>
-          <w:b/>
-          <w:i w:val="0"/>
-          <w:color w:val="2D2D2D"/>
-          <w:sz w:val="22"/>
-        </w:rPr>
-        <w:t>Smart Flight Booking Simulation Platform with LMS Integration</w:t>
-      </w:r>
-    </w:p>
-    <w:p>
-      <w:pPr>
-        <w:spacing w:after="20" w:before="0"/>
-        <w:ind w:left="170"/>
-      </w:pPr>
-      <w:r>
-        <w:rPr>
-          <w:rFonts w:ascii="Calibri" w:hAnsi="Calibri"/>
-          <w:i/>
-          <w:color w:val="666666"/>
-          <w:sz w:val="17"/>
-        </w:rPr>
-        <w:t>Capstone Project – A Data-Driven Training and Competency Assessment Tool for CTHM-CSUCC</w:t>
-      </w:r>
-    </w:p>
-    <w:p>
-      <w:pPr>
-        <w:spacing w:after="80" w:before="0" w:line="276" w:lineRule="auto"/>
-        <w:ind w:left="170"/>
-      </w:pPr>
-      <w:r>
-        <w:rPr>
-          <w:rFonts w:ascii="Calibri" w:hAnsi="Calibri"/>
-          <w:b w:val="0"/>
-          <w:i w:val="0"/>
-          <w:color w:val="2D2D2D"/>
-          <w:sz w:val="20"/>
-        </w:rPr>
-        <w:t>A simulation platform integrating flight booking ecosystems with a Learning Management System for hands-on training, competency assessment, and performance tracking of hospitality and tourism students.</w:t>
-      </w:r>
-    </w:p>
-    <w:tbl>
-      <w:tblPr>
-        <w:tblStyle w:val="TableGrid"/>
-        <w:tblW w:type="auto" w:w="0"/>
-        <w:jc w:val="left"/>
-        <w:tblLayout w:type="autofit"/>
-        <w:tblLook w:firstColumn="1" w:firstRow="1" w:lastColumn="0" w:lastRow="0" w:noHBand="0" w:noVBand="1" w:val="04A0"/>
-      </w:tblPr>
-      <w:tblGrid>
-        <w:gridCol w:w="227"/>
-        <w:gridCol w:w="8844"/>
-      </w:tblGrid>
-      <w:tr>
-        <w:tc>
-          <w:tcPr>
-            <w:tcW w:type="dxa" w:w="227"/>
-            <w:shd w:fill="2c3e6b" w:val="clear"/>
-          </w:tcPr>
-          <w:p>
-            <w:pPr>
-              <w:spacing w:before="160" w:after="160"/>
-            </w:pPr>
-          </w:p>
-        </w:tc>
-        <w:tc>
-          <w:tcPr>
-            <w:tcW w:type="dxa" w:w="8844"/>
-            <w:tcBorders>
-              <w:bottom w:val="single" w:sz="4" w:space="1" w:color="2c3e6b"/>
-            </w:tcBorders>
-          </w:tcPr>
-          <w:p>
-            <w:pPr>
-              <w:spacing w:before="120" w:after="80"/>
-              <w:ind w:left="170"/>
-            </w:pPr>
-            <w:r>
-              <w:rPr>
-                <w:rFonts w:ascii="Calibri" w:hAnsi="Calibri"/>
-                <w:b/>
-                <w:color w:val="2C3E6B"/>
-                <w:sz w:val="23"/>
-              </w:rPr>
-              <w:t>CERTIFICATIONS</w:t>
-            </w:r>
-          </w:p>
-        </w:tc>
-      </w:tr>
-    </w:tbl>
-    <w:p>
-      <w:pPr>
-        <w:spacing w:after="40" w:before="0"/>
-      </w:pPr>
-      <w:r>
-        <w:rPr>
-          <w:sz w:val="2"/>
-        </w:rPr>
+        <w:t>CERTIFICATIONS</w:t>
       </w:r>
     </w:p>
     <w:p>
       <w:pPr>
         <w:pStyle w:val="ListBullet"/>
-        <w:spacing w:after="20" w:before="0" w:line="276" w:lineRule="auto"/>
+        <w:spacing w:after="40" w:before="0"/>
         <w:ind w:left="283"/>
       </w:pPr>
       <w:r>
         <w:rPr>
           <w:rFonts w:ascii="Calibri" w:hAnsi="Calibri"/>
-          <w:color w:val="2D2D2D"/>
+          <w:color w:val="333333"/>
           <w:sz w:val="20"/>
         </w:rPr>
         <w:t>Java Programming Essentials – DICT – CBR (2025)</w:t>
@@ -872,13 +502,13 @@
     <w:p>
       <w:pPr>
         <w:pStyle w:val="ListBullet"/>
-        <w:spacing w:after="20" w:before="0" w:line="276" w:lineRule="auto"/>
+        <w:spacing w:after="40" w:before="0"/>
         <w:ind w:left="283"/>
       </w:pPr>
       <w:r>
         <w:rPr>
           <w:rFonts w:ascii="Calibri" w:hAnsi="Calibri"/>
-          <w:color w:val="2D2D2D"/>
+          <w:color w:val="333333"/>
           <w:sz w:val="20"/>
         </w:rPr>
         <w:t>Full Stack Web Development – Simplilearn (2025)</w:t>
@@ -887,13 +517,13 @@
     <w:p>
       <w:pPr>
         <w:pStyle w:val="ListBullet"/>
-        <w:spacing w:after="20" w:before="0" w:line="276" w:lineRule="auto"/>
+        <w:spacing w:after="40" w:before="0"/>
         <w:ind w:left="283"/>
       </w:pPr>
       <w:r>
         <w:rPr>
           <w:rFonts w:ascii="Calibri" w:hAnsi="Calibri"/>
-          <w:color w:val="2D2D2D"/>
+          <w:color w:val="333333"/>
           <w:sz w:val="20"/>
         </w:rPr>
         <w:t>Professional Skill-up Web Development – Udemy (2025)</w:t>
@@ -902,13 +532,13 @@
     <w:p>
       <w:pPr>
         <w:pStyle w:val="ListBullet"/>
-        <w:spacing w:after="20" w:before="0" w:line="276" w:lineRule="auto"/>
+        <w:spacing w:after="40" w:before="0"/>
         <w:ind w:left="283"/>
       </w:pPr>
       <w:r>
         <w:rPr>
           <w:rFonts w:ascii="Calibri" w:hAnsi="Calibri"/>
-          <w:color w:val="2D2D2D"/>
+          <w:color w:val="333333"/>
           <w:sz w:val="20"/>
         </w:rPr>
         <w:t>Online Career Starter Workshop – Codec (2026)</w:t>
@@ -916,7 +546,7 @@
     </w:p>
     <w:sectPr>
       <w:pgSz w:w="12240" w:h="15840"/>
-      <w:pgMar w:top="1020" w:right="1134" w:bottom="850" w:left="1134" w:header="720" w:footer="720" w:gutter="0"/>
+      <w:pgMar w:top="850" w:right="1134" w:bottom="850" w:left="1134" w:header="720" w:footer="720" w:gutter="0"/>
       <w:cols w:space="720"/>
       <w:docGrid w:linePitch="360"/>
     </w:sectPr>
@@ -1289,8 +919,8 @@
     <w:rsid w:val="00FC693F"/>
     <w:rPr>
       <w:rFonts w:ascii="Calibri" w:hAnsi="Calibri"/>
-      <w:color w:val="2D2D2D"/>
-      <w:sz w:val="20"/>
+      <w:color w:val="333333"/>
+      <w:sz w:val="21"/>
     </w:rPr>
   </w:style>
   <w:style w:type="paragraph" w:styleId="Header">

</xml_diff>